<commit_message>
Finalize curated universe (125 instruments, no single names): sync markdown + regenerate Word doc
</commit_message>
<xml_diff>
--- a/docs/Instrument_Universe.docx
+++ b/docs/Instrument_Universe.docx
@@ -931,2057 +931,6 @@
     </w:p>
     <w:p>
       <w:pPr>
-        <w:pStyle w:val="Heading3"/>
-      </w:pPr>
-      <w:r>
-        <w:t>1b. Deep-history anchor stocks (explicit — longest single-name daily series)</w:t>
-      </w:r>
-    </w:p>
-    <w:p>
-      <w:r>
-        <w:t xml:space="preserve">Free retail feeds bottom at the </w:t>
-      </w:r>
-      <w:r>
-        <w:rPr>
-          <w:b/>
-        </w:rPr>
-        <w:t>~1962 wall</w:t>
-      </w:r>
-      <w:r>
-        <w:t xml:space="preserve">; only </w:t>
-      </w:r>
-      <w:r>
-        <w:rPr>
-          <w:b/>
-        </w:rPr>
-        <w:t>CRSP</w:t>
-      </w:r>
-      <w:r>
-        <w:t xml:space="preserve"> (paid/academic) goes deeper —</w:t>
-      </w:r>
-    </w:p>
-    <w:p>
-      <w:r>
-        <w:t xml:space="preserve">daily to </w:t>
-      </w:r>
-      <w:r>
-        <w:rPr>
-          <w:b/>
-        </w:rPr>
-        <w:t>1926</w:t>
-      </w:r>
-      <w:r>
-        <w:t xml:space="preserve"> (Pre62), monthly to </w:t>
-      </w:r>
-      <w:r>
-        <w:rPr>
-          <w:b/>
-        </w:rPr>
-        <w:t>Dec 1925</w:t>
-      </w:r>
-      <w:r>
-        <w:t>. Per-name earliest:</w:t>
-      </w:r>
-    </w:p>
-    <w:tbl>
-      <w:tblPr>
-        <w:tblStyle w:val="LightGrid-Accent1"/>
-        <w:tblW w:type="auto" w:w="0"/>
-        <w:jc w:val="center"/>
-        <w:tblLook w:firstColumn="1" w:firstRow="1" w:lastColumn="0" w:lastRow="0" w:noHBand="0" w:noVBand="1" w:val="04A0"/>
-      </w:tblPr>
-      <w:tblGrid>
-        <w:gridCol w:w="1728"/>
-        <w:gridCol w:w="1728"/>
-        <w:gridCol w:w="1728"/>
-        <w:gridCol w:w="1728"/>
-        <w:gridCol w:w="1728"/>
-      </w:tblGrid>
-      <w:tr>
-        <w:tc>
-          <w:tcPr>
-            <w:tcW w:type="dxa" w:w="1728"/>
-          </w:tcPr>
-          <w:p>
-            <w:r>
-              <w:rPr>
-                <w:b/>
-                <w:sz w:val="17"/>
-              </w:rPr>
-              <w:t>Ticker</w:t>
-            </w:r>
-          </w:p>
-        </w:tc>
-        <w:tc>
-          <w:tcPr>
-            <w:tcW w:type="dxa" w:w="1728"/>
-          </w:tcPr>
-          <w:p>
-            <w:r>
-              <w:rPr>
-                <w:b/>
-                <w:sz w:val="17"/>
-              </w:rPr>
-              <w:t>Company</w:t>
-            </w:r>
-          </w:p>
-        </w:tc>
-        <w:tc>
-          <w:tcPr>
-            <w:tcW w:type="dxa" w:w="1728"/>
-          </w:tcPr>
-          <w:p>
-            <w:r>
-              <w:rPr>
-                <w:b/>
-                <w:sz w:val="17"/>
-              </w:rPr>
-              <w:t>GICS sector</w:t>
-            </w:r>
-          </w:p>
-        </w:tc>
-        <w:tc>
-          <w:tcPr>
-            <w:tcW w:type="dxa" w:w="1728"/>
-          </w:tcPr>
-          <w:p>
-            <w:r>
-              <w:rPr>
-                <w:b/>
-                <w:sz w:val="17"/>
-              </w:rPr>
-              <w:t>Free-feed daily</w:t>
-            </w:r>
-          </w:p>
-        </w:tc>
-        <w:tc>
-          <w:tcPr>
-            <w:tcW w:type="dxa" w:w="1728"/>
-          </w:tcPr>
-          <w:p>
-            <w:r>
-              <w:rPr>
-                <w:b/>
-                <w:sz w:val="17"/>
-              </w:rPr>
-              <w:t>CRSP earliest</w:t>
-            </w:r>
-          </w:p>
-        </w:tc>
-      </w:tr>
-      <w:tr>
-        <w:tc>
-          <w:tcPr>
-            <w:tcW w:type="dxa" w:w="1728"/>
-          </w:tcPr>
-          <w:p>
-            <w:r>
-              <w:rPr>
-                <w:sz w:val="17"/>
-              </w:rPr>
-              <w:t>GE</w:t>
-            </w:r>
-          </w:p>
-        </w:tc>
-        <w:tc>
-          <w:tcPr>
-            <w:tcW w:type="dxa" w:w="1728"/>
-          </w:tcPr>
-          <w:p>
-            <w:r>
-              <w:rPr>
-                <w:sz w:val="17"/>
-              </w:rPr>
-              <w:t>General Electric</w:t>
-            </w:r>
-          </w:p>
-        </w:tc>
-        <w:tc>
-          <w:tcPr>
-            <w:tcW w:type="dxa" w:w="1728"/>
-          </w:tcPr>
-          <w:p>
-            <w:r>
-              <w:rPr>
-                <w:sz w:val="17"/>
-              </w:rPr>
-              <w:t>Industrials</w:t>
-            </w:r>
-          </w:p>
-        </w:tc>
-        <w:tc>
-          <w:tcPr>
-            <w:tcW w:type="dxa" w:w="1728"/>
-          </w:tcPr>
-          <w:p>
-            <w:r>
-              <w:rPr>
-                <w:sz w:val="17"/>
-              </w:rPr>
-              <w:t>1962</w:t>
-            </w:r>
-          </w:p>
-        </w:tc>
-        <w:tc>
-          <w:tcPr>
-            <w:tcW w:type="dxa" w:w="1728"/>
-          </w:tcPr>
-          <w:p>
-            <w:r>
-              <w:rPr>
-                <w:b/>
-                <w:sz w:val="17"/>
-              </w:rPr>
-              <w:t>1925-12</w:t>
-            </w:r>
-            <w:r>
-              <w:rPr>
-                <w:sz w:val="17"/>
-              </w:rPr>
-              <w:t xml:space="preserve"> (NYSE 1892)</w:t>
-            </w:r>
-          </w:p>
-        </w:tc>
-      </w:tr>
-      <w:tr>
-        <w:tc>
-          <w:tcPr>
-            <w:tcW w:type="dxa" w:w="1728"/>
-          </w:tcPr>
-          <w:p>
-            <w:r>
-              <w:rPr>
-                <w:sz w:val="17"/>
-              </w:rPr>
-              <w:t>IBM</w:t>
-            </w:r>
-          </w:p>
-        </w:tc>
-        <w:tc>
-          <w:tcPr>
-            <w:tcW w:type="dxa" w:w="1728"/>
-          </w:tcPr>
-          <w:p>
-            <w:r>
-              <w:rPr>
-                <w:sz w:val="17"/>
-              </w:rPr>
-              <w:t>IBM</w:t>
-            </w:r>
-          </w:p>
-        </w:tc>
-        <w:tc>
-          <w:tcPr>
-            <w:tcW w:type="dxa" w:w="1728"/>
-          </w:tcPr>
-          <w:p>
-            <w:r>
-              <w:rPr>
-                <w:sz w:val="17"/>
-              </w:rPr>
-              <w:t>Info Tech</w:t>
-            </w:r>
-          </w:p>
-        </w:tc>
-        <w:tc>
-          <w:tcPr>
-            <w:tcW w:type="dxa" w:w="1728"/>
-          </w:tcPr>
-          <w:p>
-            <w:r>
-              <w:rPr>
-                <w:sz w:val="17"/>
-              </w:rPr>
-              <w:t>1962</w:t>
-            </w:r>
-          </w:p>
-        </w:tc>
-        <w:tc>
-          <w:tcPr>
-            <w:tcW w:type="dxa" w:w="1728"/>
-          </w:tcPr>
-          <w:p>
-            <w:r>
-              <w:rPr>
-                <w:b/>
-                <w:sz w:val="17"/>
-              </w:rPr>
-              <w:t>1925-12</w:t>
-            </w:r>
-            <w:r>
-              <w:rPr>
-                <w:sz w:val="17"/>
-              </w:rPr>
-              <w:t xml:space="preserve"> (1915)</w:t>
-            </w:r>
-          </w:p>
-        </w:tc>
-      </w:tr>
-      <w:tr>
-        <w:tc>
-          <w:tcPr>
-            <w:tcW w:type="dxa" w:w="1728"/>
-          </w:tcPr>
-          <w:p>
-            <w:r>
-              <w:rPr>
-                <w:sz w:val="17"/>
-              </w:rPr>
-              <w:t>KO</w:t>
-            </w:r>
-          </w:p>
-        </w:tc>
-        <w:tc>
-          <w:tcPr>
-            <w:tcW w:type="dxa" w:w="1728"/>
-          </w:tcPr>
-          <w:p>
-            <w:r>
-              <w:rPr>
-                <w:sz w:val="17"/>
-              </w:rPr>
-              <w:t>Coca-Cola</w:t>
-            </w:r>
-          </w:p>
-        </w:tc>
-        <w:tc>
-          <w:tcPr>
-            <w:tcW w:type="dxa" w:w="1728"/>
-          </w:tcPr>
-          <w:p>
-            <w:r>
-              <w:rPr>
-                <w:sz w:val="17"/>
-              </w:rPr>
-              <w:t>Staples</w:t>
-            </w:r>
-          </w:p>
-        </w:tc>
-        <w:tc>
-          <w:tcPr>
-            <w:tcW w:type="dxa" w:w="1728"/>
-          </w:tcPr>
-          <w:p>
-            <w:r>
-              <w:rPr>
-                <w:sz w:val="17"/>
-              </w:rPr>
-              <w:t>1962</w:t>
-            </w:r>
-          </w:p>
-        </w:tc>
-        <w:tc>
-          <w:tcPr>
-            <w:tcW w:type="dxa" w:w="1728"/>
-          </w:tcPr>
-          <w:p>
-            <w:r>
-              <w:rPr>
-                <w:b/>
-                <w:sz w:val="17"/>
-              </w:rPr>
-              <w:t>1925-12</w:t>
-            </w:r>
-            <w:r>
-              <w:rPr>
-                <w:sz w:val="17"/>
-              </w:rPr>
-              <w:t xml:space="preserve"> (1919)</w:t>
-            </w:r>
-          </w:p>
-        </w:tc>
-      </w:tr>
-      <w:tr>
-        <w:tc>
-          <w:tcPr>
-            <w:tcW w:type="dxa" w:w="1728"/>
-          </w:tcPr>
-          <w:p>
-            <w:r>
-              <w:rPr>
-                <w:sz w:val="17"/>
-              </w:rPr>
-              <w:t>PG</w:t>
-            </w:r>
-          </w:p>
-        </w:tc>
-        <w:tc>
-          <w:tcPr>
-            <w:tcW w:type="dxa" w:w="1728"/>
-          </w:tcPr>
-          <w:p>
-            <w:r>
-              <w:rPr>
-                <w:sz w:val="17"/>
-              </w:rPr>
-              <w:t>Procter &amp; Gamble</w:t>
-            </w:r>
-          </w:p>
-        </w:tc>
-        <w:tc>
-          <w:tcPr>
-            <w:tcW w:type="dxa" w:w="1728"/>
-          </w:tcPr>
-          <w:p>
-            <w:r>
-              <w:rPr>
-                <w:sz w:val="17"/>
-              </w:rPr>
-              <w:t>Staples</w:t>
-            </w:r>
-          </w:p>
-        </w:tc>
-        <w:tc>
-          <w:tcPr>
-            <w:tcW w:type="dxa" w:w="1728"/>
-          </w:tcPr>
-          <w:p>
-            <w:r>
-              <w:rPr>
-                <w:sz w:val="17"/>
-              </w:rPr>
-              <w:t>1962</w:t>
-            </w:r>
-          </w:p>
-        </w:tc>
-        <w:tc>
-          <w:tcPr>
-            <w:tcW w:type="dxa" w:w="1728"/>
-          </w:tcPr>
-          <w:p>
-            <w:r>
-              <w:rPr>
-                <w:b/>
-                <w:sz w:val="17"/>
-              </w:rPr>
-              <w:t>1925-12</w:t>
-            </w:r>
-            <w:r>
-              <w:rPr>
-                <w:sz w:val="17"/>
-              </w:rPr>
-              <w:t xml:space="preserve"> (1891)</w:t>
-            </w:r>
-          </w:p>
-        </w:tc>
-      </w:tr>
-      <w:tr>
-        <w:tc>
-          <w:tcPr>
-            <w:tcW w:type="dxa" w:w="1728"/>
-          </w:tcPr>
-          <w:p>
-            <w:r>
-              <w:rPr>
-                <w:sz w:val="17"/>
-              </w:rPr>
-              <w:t>XOM</w:t>
-            </w:r>
-          </w:p>
-        </w:tc>
-        <w:tc>
-          <w:tcPr>
-            <w:tcW w:type="dxa" w:w="1728"/>
-          </w:tcPr>
-          <w:p>
-            <w:r>
-              <w:rPr>
-                <w:sz w:val="17"/>
-              </w:rPr>
-              <w:t>Exxon Mobil</w:t>
-            </w:r>
-          </w:p>
-        </w:tc>
-        <w:tc>
-          <w:tcPr>
-            <w:tcW w:type="dxa" w:w="1728"/>
-          </w:tcPr>
-          <w:p>
-            <w:r>
-              <w:rPr>
-                <w:sz w:val="17"/>
-              </w:rPr>
-              <w:t>Energy</w:t>
-            </w:r>
-          </w:p>
-        </w:tc>
-        <w:tc>
-          <w:tcPr>
-            <w:tcW w:type="dxa" w:w="1728"/>
-          </w:tcPr>
-          <w:p>
-            <w:r>
-              <w:rPr>
-                <w:sz w:val="17"/>
-              </w:rPr>
-              <w:t>1962</w:t>
-            </w:r>
-          </w:p>
-        </w:tc>
-        <w:tc>
-          <w:tcPr>
-            <w:tcW w:type="dxa" w:w="1728"/>
-          </w:tcPr>
-          <w:p>
-            <w:r>
-              <w:rPr>
-                <w:b/>
-                <w:sz w:val="17"/>
-              </w:rPr>
-              <w:t>1925-12</w:t>
-            </w:r>
-          </w:p>
-        </w:tc>
-      </w:tr>
-      <w:tr>
-        <w:tc>
-          <w:tcPr>
-            <w:tcW w:type="dxa" w:w="1728"/>
-          </w:tcPr>
-          <w:p>
-            <w:r>
-              <w:rPr>
-                <w:sz w:val="17"/>
-              </w:rPr>
-              <w:t>CVX</w:t>
-            </w:r>
-          </w:p>
-        </w:tc>
-        <w:tc>
-          <w:tcPr>
-            <w:tcW w:type="dxa" w:w="1728"/>
-          </w:tcPr>
-          <w:p>
-            <w:r>
-              <w:rPr>
-                <w:sz w:val="17"/>
-              </w:rPr>
-              <w:t>Chevron</w:t>
-            </w:r>
-          </w:p>
-        </w:tc>
-        <w:tc>
-          <w:tcPr>
-            <w:tcW w:type="dxa" w:w="1728"/>
-          </w:tcPr>
-          <w:p>
-            <w:r>
-              <w:rPr>
-                <w:sz w:val="17"/>
-              </w:rPr>
-              <w:t>Energy</w:t>
-            </w:r>
-          </w:p>
-        </w:tc>
-        <w:tc>
-          <w:tcPr>
-            <w:tcW w:type="dxa" w:w="1728"/>
-          </w:tcPr>
-          <w:p>
-            <w:r>
-              <w:rPr>
-                <w:sz w:val="17"/>
-              </w:rPr>
-              <w:t>1962</w:t>
-            </w:r>
-          </w:p>
-        </w:tc>
-        <w:tc>
-          <w:tcPr>
-            <w:tcW w:type="dxa" w:w="1728"/>
-          </w:tcPr>
-          <w:p>
-            <w:r>
-              <w:rPr>
-                <w:b/>
-                <w:sz w:val="17"/>
-              </w:rPr>
-              <w:t>1925-12</w:t>
-            </w:r>
-          </w:p>
-        </w:tc>
-      </w:tr>
-      <w:tr>
-        <w:tc>
-          <w:tcPr>
-            <w:tcW w:type="dxa" w:w="1728"/>
-          </w:tcPr>
-          <w:p>
-            <w:r>
-              <w:rPr>
-                <w:sz w:val="17"/>
-              </w:rPr>
-              <w:t>MO</w:t>
-            </w:r>
-          </w:p>
-        </w:tc>
-        <w:tc>
-          <w:tcPr>
-            <w:tcW w:type="dxa" w:w="1728"/>
-          </w:tcPr>
-          <w:p>
-            <w:r>
-              <w:rPr>
-                <w:sz w:val="17"/>
-              </w:rPr>
-              <w:t>Altria</w:t>
-            </w:r>
-          </w:p>
-        </w:tc>
-        <w:tc>
-          <w:tcPr>
-            <w:tcW w:type="dxa" w:w="1728"/>
-          </w:tcPr>
-          <w:p>
-            <w:r>
-              <w:rPr>
-                <w:sz w:val="17"/>
-              </w:rPr>
-              <w:t>Staples</w:t>
-            </w:r>
-          </w:p>
-        </w:tc>
-        <w:tc>
-          <w:tcPr>
-            <w:tcW w:type="dxa" w:w="1728"/>
-          </w:tcPr>
-          <w:p>
-            <w:r>
-              <w:rPr>
-                <w:sz w:val="17"/>
-              </w:rPr>
-              <w:t>1962</w:t>
-            </w:r>
-          </w:p>
-        </w:tc>
-        <w:tc>
-          <w:tcPr>
-            <w:tcW w:type="dxa" w:w="1728"/>
-          </w:tcPr>
-          <w:p>
-            <w:r>
-              <w:rPr>
-                <w:b/>
-                <w:sz w:val="17"/>
-              </w:rPr>
-              <w:t>1925-12</w:t>
-            </w:r>
-          </w:p>
-        </w:tc>
-      </w:tr>
-      <w:tr>
-        <w:tc>
-          <w:tcPr>
-            <w:tcW w:type="dxa" w:w="1728"/>
-          </w:tcPr>
-          <w:p>
-            <w:r>
-              <w:rPr>
-                <w:sz w:val="17"/>
-              </w:rPr>
-              <w:t>PEP</w:t>
-            </w:r>
-          </w:p>
-        </w:tc>
-        <w:tc>
-          <w:tcPr>
-            <w:tcW w:type="dxa" w:w="1728"/>
-          </w:tcPr>
-          <w:p>
-            <w:r>
-              <w:rPr>
-                <w:sz w:val="17"/>
-              </w:rPr>
-              <w:t>PepsiCo</w:t>
-            </w:r>
-          </w:p>
-        </w:tc>
-        <w:tc>
-          <w:tcPr>
-            <w:tcW w:type="dxa" w:w="1728"/>
-          </w:tcPr>
-          <w:p>
-            <w:r>
-              <w:rPr>
-                <w:sz w:val="17"/>
-              </w:rPr>
-              <w:t>Staples</w:t>
-            </w:r>
-          </w:p>
-        </w:tc>
-        <w:tc>
-          <w:tcPr>
-            <w:tcW w:type="dxa" w:w="1728"/>
-          </w:tcPr>
-          <w:p>
-            <w:r>
-              <w:rPr>
-                <w:sz w:val="17"/>
-              </w:rPr>
-              <w:t>1962</w:t>
-            </w:r>
-          </w:p>
-        </w:tc>
-        <w:tc>
-          <w:tcPr>
-            <w:tcW w:type="dxa" w:w="1728"/>
-          </w:tcPr>
-          <w:p>
-            <w:r>
-              <w:rPr>
-                <w:b/>
-                <w:sz w:val="17"/>
-              </w:rPr>
-              <w:t>1925-12</w:t>
-            </w:r>
-          </w:p>
-        </w:tc>
-      </w:tr>
-      <w:tr>
-        <w:tc>
-          <w:tcPr>
-            <w:tcW w:type="dxa" w:w="1728"/>
-          </w:tcPr>
-          <w:p>
-            <w:r>
-              <w:rPr>
-                <w:sz w:val="17"/>
-              </w:rPr>
-              <w:t>GD</w:t>
-            </w:r>
-          </w:p>
-        </w:tc>
-        <w:tc>
-          <w:tcPr>
-            <w:tcW w:type="dxa" w:w="1728"/>
-          </w:tcPr>
-          <w:p>
-            <w:r>
-              <w:rPr>
-                <w:sz w:val="17"/>
-              </w:rPr>
-              <w:t>General Dynamics</w:t>
-            </w:r>
-          </w:p>
-        </w:tc>
-        <w:tc>
-          <w:tcPr>
-            <w:tcW w:type="dxa" w:w="1728"/>
-          </w:tcPr>
-          <w:p>
-            <w:r>
-              <w:rPr>
-                <w:sz w:val="17"/>
-              </w:rPr>
-              <w:t>Industrials</w:t>
-            </w:r>
-          </w:p>
-        </w:tc>
-        <w:tc>
-          <w:tcPr>
-            <w:tcW w:type="dxa" w:w="1728"/>
-          </w:tcPr>
-          <w:p>
-            <w:r>
-              <w:rPr>
-                <w:sz w:val="17"/>
-              </w:rPr>
-              <w:t>1962</w:t>
-            </w:r>
-          </w:p>
-        </w:tc>
-        <w:tc>
-          <w:tcPr>
-            <w:tcW w:type="dxa" w:w="1728"/>
-          </w:tcPr>
-          <w:p>
-            <w:r>
-              <w:rPr>
-                <w:b/>
-                <w:sz w:val="17"/>
-              </w:rPr>
-              <w:t>1925-12</w:t>
-            </w:r>
-          </w:p>
-        </w:tc>
-      </w:tr>
-      <w:tr>
-        <w:tc>
-          <w:tcPr>
-            <w:tcW w:type="dxa" w:w="1728"/>
-          </w:tcPr>
-          <w:p>
-            <w:r>
-              <w:rPr>
-                <w:sz w:val="17"/>
-              </w:rPr>
-              <w:t>HON</w:t>
-            </w:r>
-          </w:p>
-        </w:tc>
-        <w:tc>
-          <w:tcPr>
-            <w:tcW w:type="dxa" w:w="1728"/>
-          </w:tcPr>
-          <w:p>
-            <w:r>
-              <w:rPr>
-                <w:sz w:val="17"/>
-              </w:rPr>
-              <w:t>Honeywell</w:t>
-            </w:r>
-          </w:p>
-        </w:tc>
-        <w:tc>
-          <w:tcPr>
-            <w:tcW w:type="dxa" w:w="1728"/>
-          </w:tcPr>
-          <w:p>
-            <w:r>
-              <w:rPr>
-                <w:sz w:val="17"/>
-              </w:rPr>
-              <w:t>Industrials</w:t>
-            </w:r>
-          </w:p>
-        </w:tc>
-        <w:tc>
-          <w:tcPr>
-            <w:tcW w:type="dxa" w:w="1728"/>
-          </w:tcPr>
-          <w:p>
-            <w:r>
-              <w:rPr>
-                <w:sz w:val="17"/>
-              </w:rPr>
-              <w:t>1962</w:t>
-            </w:r>
-          </w:p>
-        </w:tc>
-        <w:tc>
-          <w:tcPr>
-            <w:tcW w:type="dxa" w:w="1728"/>
-          </w:tcPr>
-          <w:p>
-            <w:r>
-              <w:rPr>
-                <w:b/>
-                <w:sz w:val="17"/>
-              </w:rPr>
-              <w:t>1925-12</w:t>
-            </w:r>
-          </w:p>
-        </w:tc>
-      </w:tr>
-      <w:tr>
-        <w:tc>
-          <w:tcPr>
-            <w:tcW w:type="dxa" w:w="1728"/>
-          </w:tcPr>
-          <w:p>
-            <w:r>
-              <w:rPr>
-                <w:sz w:val="17"/>
-              </w:rPr>
-              <w:t>T</w:t>
-            </w:r>
-          </w:p>
-        </w:tc>
-        <w:tc>
-          <w:tcPr>
-            <w:tcW w:type="dxa" w:w="1728"/>
-          </w:tcPr>
-          <w:p>
-            <w:r>
-              <w:rPr>
-                <w:sz w:val="17"/>
-              </w:rPr>
-              <w:t>AT&amp;T</w:t>
-            </w:r>
-          </w:p>
-        </w:tc>
-        <w:tc>
-          <w:tcPr>
-            <w:tcW w:type="dxa" w:w="1728"/>
-          </w:tcPr>
-          <w:p>
-            <w:r>
-              <w:rPr>
-                <w:sz w:val="17"/>
-              </w:rPr>
-              <w:t>Comm Svcs</w:t>
-            </w:r>
-          </w:p>
-        </w:tc>
-        <w:tc>
-          <w:tcPr>
-            <w:tcW w:type="dxa" w:w="1728"/>
-          </w:tcPr>
-          <w:p>
-            <w:r>
-              <w:rPr>
-                <w:sz w:val="17"/>
-              </w:rPr>
-              <w:t>1962</w:t>
-            </w:r>
-          </w:p>
-        </w:tc>
-        <w:tc>
-          <w:tcPr>
-            <w:tcW w:type="dxa" w:w="1728"/>
-          </w:tcPr>
-          <w:p>
-            <w:r>
-              <w:rPr>
-                <w:sz w:val="17"/>
-              </w:rPr>
-              <w:t>1925-12 (old AT&amp;T; entity break 1984)</w:t>
-            </w:r>
-          </w:p>
-        </w:tc>
-      </w:tr>
-      <w:tr>
-        <w:tc>
-          <w:tcPr>
-            <w:tcW w:type="dxa" w:w="1728"/>
-          </w:tcPr>
-          <w:p>
-            <w:r>
-              <w:rPr>
-                <w:sz w:val="17"/>
-              </w:rPr>
-              <w:t>GIS</w:t>
-            </w:r>
-          </w:p>
-        </w:tc>
-        <w:tc>
-          <w:tcPr>
-            <w:tcW w:type="dxa" w:w="1728"/>
-          </w:tcPr>
-          <w:p>
-            <w:r>
-              <w:rPr>
-                <w:sz w:val="17"/>
-              </w:rPr>
-              <w:t>General Mills</w:t>
-            </w:r>
-          </w:p>
-        </w:tc>
-        <w:tc>
-          <w:tcPr>
-            <w:tcW w:type="dxa" w:w="1728"/>
-          </w:tcPr>
-          <w:p>
-            <w:r>
-              <w:rPr>
-                <w:sz w:val="17"/>
-              </w:rPr>
-              <w:t>Staples</w:t>
-            </w:r>
-          </w:p>
-        </w:tc>
-        <w:tc>
-          <w:tcPr>
-            <w:tcW w:type="dxa" w:w="1728"/>
-          </w:tcPr>
-          <w:p>
-            <w:r>
-              <w:rPr>
-                <w:sz w:val="17"/>
-              </w:rPr>
-              <w:t>1962</w:t>
-            </w:r>
-          </w:p>
-        </w:tc>
-        <w:tc>
-          <w:tcPr>
-            <w:tcW w:type="dxa" w:w="1728"/>
-          </w:tcPr>
-          <w:p>
-            <w:r>
-              <w:rPr>
-                <w:sz w:val="17"/>
-              </w:rPr>
-              <w:t>1928</w:t>
-            </w:r>
-          </w:p>
-        </w:tc>
-      </w:tr>
-      <w:tr>
-        <w:tc>
-          <w:tcPr>
-            <w:tcW w:type="dxa" w:w="1728"/>
-          </w:tcPr>
-          <w:p>
-            <w:r>
-              <w:rPr>
-                <w:sz w:val="17"/>
-              </w:rPr>
-              <w:t>CAT</w:t>
-            </w:r>
-          </w:p>
-        </w:tc>
-        <w:tc>
-          <w:tcPr>
-            <w:tcW w:type="dxa" w:w="1728"/>
-          </w:tcPr>
-          <w:p>
-            <w:r>
-              <w:rPr>
-                <w:sz w:val="17"/>
-              </w:rPr>
-              <w:t>Caterpillar</w:t>
-            </w:r>
-          </w:p>
-        </w:tc>
-        <w:tc>
-          <w:tcPr>
-            <w:tcW w:type="dxa" w:w="1728"/>
-          </w:tcPr>
-          <w:p>
-            <w:r>
-              <w:rPr>
-                <w:sz w:val="17"/>
-              </w:rPr>
-              <w:t>Industrials</w:t>
-            </w:r>
-          </w:p>
-        </w:tc>
-        <w:tc>
-          <w:tcPr>
-            <w:tcW w:type="dxa" w:w="1728"/>
-          </w:tcPr>
-          <w:p>
-            <w:r>
-              <w:rPr>
-                <w:sz w:val="17"/>
-              </w:rPr>
-              <w:t>1962</w:t>
-            </w:r>
-          </w:p>
-        </w:tc>
-        <w:tc>
-          <w:tcPr>
-            <w:tcW w:type="dxa" w:w="1728"/>
-          </w:tcPr>
-          <w:p>
-            <w:r>
-              <w:rPr>
-                <w:sz w:val="17"/>
-              </w:rPr>
-              <w:t>1929</w:t>
-            </w:r>
-          </w:p>
-        </w:tc>
-      </w:tr>
-      <w:tr>
-        <w:tc>
-          <w:tcPr>
-            <w:tcW w:type="dxa" w:w="1728"/>
-          </w:tcPr>
-          <w:p>
-            <w:r>
-              <w:rPr>
-                <w:sz w:val="17"/>
-              </w:rPr>
-              <w:t>BA</w:t>
-            </w:r>
-          </w:p>
-        </w:tc>
-        <w:tc>
-          <w:tcPr>
-            <w:tcW w:type="dxa" w:w="1728"/>
-          </w:tcPr>
-          <w:p>
-            <w:r>
-              <w:rPr>
-                <w:sz w:val="17"/>
-              </w:rPr>
-              <w:t>Boeing</w:t>
-            </w:r>
-          </w:p>
-        </w:tc>
-        <w:tc>
-          <w:tcPr>
-            <w:tcW w:type="dxa" w:w="1728"/>
-          </w:tcPr>
-          <w:p>
-            <w:r>
-              <w:rPr>
-                <w:sz w:val="17"/>
-              </w:rPr>
-              <w:t>Industrials</w:t>
-            </w:r>
-          </w:p>
-        </w:tc>
-        <w:tc>
-          <w:tcPr>
-            <w:tcW w:type="dxa" w:w="1728"/>
-          </w:tcPr>
-          <w:p>
-            <w:r>
-              <w:rPr>
-                <w:sz w:val="17"/>
-              </w:rPr>
-              <w:t>1962</w:t>
-            </w:r>
-          </w:p>
-        </w:tc>
-        <w:tc>
-          <w:tcPr>
-            <w:tcW w:type="dxa" w:w="1728"/>
-          </w:tcPr>
-          <w:p>
-            <w:r>
-              <w:rPr>
-                <w:sz w:val="17"/>
-              </w:rPr>
-              <w:t>1934</w:t>
-            </w:r>
-          </w:p>
-        </w:tc>
-      </w:tr>
-      <w:tr>
-        <w:tc>
-          <w:tcPr>
-            <w:tcW w:type="dxa" w:w="1728"/>
-          </w:tcPr>
-          <w:p>
-            <w:r>
-              <w:rPr>
-                <w:sz w:val="17"/>
-              </w:rPr>
-              <w:t>MRK</w:t>
-            </w:r>
-          </w:p>
-        </w:tc>
-        <w:tc>
-          <w:tcPr>
-            <w:tcW w:type="dxa" w:w="1728"/>
-          </w:tcPr>
-          <w:p>
-            <w:r>
-              <w:rPr>
-                <w:sz w:val="17"/>
-              </w:rPr>
-              <w:t>Merck</w:t>
-            </w:r>
-          </w:p>
-        </w:tc>
-        <w:tc>
-          <w:tcPr>
-            <w:tcW w:type="dxa" w:w="1728"/>
-          </w:tcPr>
-          <w:p>
-            <w:r>
-              <w:rPr>
-                <w:sz w:val="17"/>
-              </w:rPr>
-              <w:t>Health Care</w:t>
-            </w:r>
-          </w:p>
-        </w:tc>
-        <w:tc>
-          <w:tcPr>
-            <w:tcW w:type="dxa" w:w="1728"/>
-          </w:tcPr>
-          <w:p>
-            <w:r>
-              <w:rPr>
-                <w:sz w:val="17"/>
-              </w:rPr>
-              <w:t>1962</w:t>
-            </w:r>
-          </w:p>
-        </w:tc>
-        <w:tc>
-          <w:tcPr>
-            <w:tcW w:type="dxa" w:w="1728"/>
-          </w:tcPr>
-          <w:p>
-            <w:r>
-              <w:rPr>
-                <w:sz w:val="17"/>
-              </w:rPr>
-              <w:t>~1946</w:t>
-            </w:r>
-          </w:p>
-        </w:tc>
-      </w:tr>
-      <w:tr>
-        <w:tc>
-          <w:tcPr>
-            <w:tcW w:type="dxa" w:w="1728"/>
-          </w:tcPr>
-          <w:p>
-            <w:r>
-              <w:rPr>
-                <w:sz w:val="17"/>
-              </w:rPr>
-              <w:t>MMM</w:t>
-            </w:r>
-          </w:p>
-        </w:tc>
-        <w:tc>
-          <w:tcPr>
-            <w:tcW w:type="dxa" w:w="1728"/>
-          </w:tcPr>
-          <w:p>
-            <w:r>
-              <w:rPr>
-                <w:sz w:val="17"/>
-              </w:rPr>
-              <w:t>3M</w:t>
-            </w:r>
-          </w:p>
-        </w:tc>
-        <w:tc>
-          <w:tcPr>
-            <w:tcW w:type="dxa" w:w="1728"/>
-          </w:tcPr>
-          <w:p>
-            <w:r>
-              <w:rPr>
-                <w:sz w:val="17"/>
-              </w:rPr>
-              <w:t>Industrials</w:t>
-            </w:r>
-          </w:p>
-        </w:tc>
-        <w:tc>
-          <w:tcPr>
-            <w:tcW w:type="dxa" w:w="1728"/>
-          </w:tcPr>
-          <w:p>
-            <w:r>
-              <w:rPr>
-                <w:sz w:val="17"/>
-              </w:rPr>
-              <w:t>1962</w:t>
-            </w:r>
-          </w:p>
-        </w:tc>
-        <w:tc>
-          <w:tcPr>
-            <w:tcW w:type="dxa" w:w="1728"/>
-          </w:tcPr>
-          <w:p>
-            <w:r>
-              <w:rPr>
-                <w:sz w:val="17"/>
-              </w:rPr>
-              <w:t>1946</w:t>
-            </w:r>
-          </w:p>
-        </w:tc>
-      </w:tr>
-      <w:tr>
-        <w:tc>
-          <w:tcPr>
-            <w:tcW w:type="dxa" w:w="1728"/>
-          </w:tcPr>
-          <w:p>
-            <w:r>
-              <w:rPr>
-                <w:sz w:val="17"/>
-              </w:rPr>
-              <w:t>JNJ</w:t>
-            </w:r>
-          </w:p>
-        </w:tc>
-        <w:tc>
-          <w:tcPr>
-            <w:tcW w:type="dxa" w:w="1728"/>
-          </w:tcPr>
-          <w:p>
-            <w:r>
-              <w:rPr>
-                <w:sz w:val="17"/>
-              </w:rPr>
-              <w:t>Johnson &amp; Johnson</w:t>
-            </w:r>
-          </w:p>
-        </w:tc>
-        <w:tc>
-          <w:tcPr>
-            <w:tcW w:type="dxa" w:w="1728"/>
-          </w:tcPr>
-          <w:p>
-            <w:r>
-              <w:rPr>
-                <w:sz w:val="17"/>
-              </w:rPr>
-              <w:t>Health Care</w:t>
-            </w:r>
-          </w:p>
-        </w:tc>
-        <w:tc>
-          <w:tcPr>
-            <w:tcW w:type="dxa" w:w="1728"/>
-          </w:tcPr>
-          <w:p>
-            <w:r>
-              <w:rPr>
-                <w:sz w:val="17"/>
-              </w:rPr>
-              <w:t>1962</w:t>
-            </w:r>
-          </w:p>
-        </w:tc>
-        <w:tc>
-          <w:tcPr>
-            <w:tcW w:type="dxa" w:w="1728"/>
-          </w:tcPr>
-          <w:p>
-            <w:r>
-              <w:rPr>
-                <w:sz w:val="17"/>
-              </w:rPr>
-              <w:t>1944</w:t>
-            </w:r>
-          </w:p>
-        </w:tc>
-      </w:tr>
-      <w:tr>
-        <w:tc>
-          <w:tcPr>
-            <w:tcW w:type="dxa" w:w="1728"/>
-          </w:tcPr>
-          <w:p>
-            <w:r>
-              <w:rPr>
-                <w:sz w:val="17"/>
-              </w:rPr>
-              <w:t>PFE</w:t>
-            </w:r>
-          </w:p>
-        </w:tc>
-        <w:tc>
-          <w:tcPr>
-            <w:tcW w:type="dxa" w:w="1728"/>
-          </w:tcPr>
-          <w:p>
-            <w:r>
-              <w:rPr>
-                <w:sz w:val="17"/>
-              </w:rPr>
-              <w:t>Pfizer</w:t>
-            </w:r>
-          </w:p>
-        </w:tc>
-        <w:tc>
-          <w:tcPr>
-            <w:tcW w:type="dxa" w:w="1728"/>
-          </w:tcPr>
-          <w:p>
-            <w:r>
-              <w:rPr>
-                <w:sz w:val="17"/>
-              </w:rPr>
-              <w:t>Health Care</w:t>
-            </w:r>
-          </w:p>
-        </w:tc>
-        <w:tc>
-          <w:tcPr>
-            <w:tcW w:type="dxa" w:w="1728"/>
-          </w:tcPr>
-          <w:p>
-            <w:r>
-              <w:rPr>
-                <w:sz w:val="17"/>
-              </w:rPr>
-              <w:t>1962–72</w:t>
-            </w:r>
-          </w:p>
-        </w:tc>
-        <w:tc>
-          <w:tcPr>
-            <w:tcW w:type="dxa" w:w="1728"/>
-          </w:tcPr>
-          <w:p>
-            <w:r>
-              <w:rPr>
-                <w:sz w:val="17"/>
-              </w:rPr>
-              <w:t>1944</w:t>
-            </w:r>
-          </w:p>
-        </w:tc>
-      </w:tr>
-      <w:tr>
-        <w:tc>
-          <w:tcPr>
-            <w:tcW w:type="dxa" w:w="1728"/>
-          </w:tcPr>
-          <w:p>
-            <w:r>
-              <w:rPr>
-                <w:sz w:val="17"/>
-              </w:rPr>
-              <w:t>F</w:t>
-            </w:r>
-          </w:p>
-        </w:tc>
-        <w:tc>
-          <w:tcPr>
-            <w:tcW w:type="dxa" w:w="1728"/>
-          </w:tcPr>
-          <w:p>
-            <w:r>
-              <w:rPr>
-                <w:sz w:val="17"/>
-              </w:rPr>
-              <w:t>Ford Motor</w:t>
-            </w:r>
-          </w:p>
-        </w:tc>
-        <w:tc>
-          <w:tcPr>
-            <w:tcW w:type="dxa" w:w="1728"/>
-          </w:tcPr>
-          <w:p>
-            <w:r>
-              <w:rPr>
-                <w:sz w:val="17"/>
-              </w:rPr>
-              <w:t>Cons Disc</w:t>
-            </w:r>
-          </w:p>
-        </w:tc>
-        <w:tc>
-          <w:tcPr>
-            <w:tcW w:type="dxa" w:w="1728"/>
-          </w:tcPr>
-          <w:p>
-            <w:r>
-              <w:rPr>
-                <w:sz w:val="17"/>
-              </w:rPr>
-              <w:t>1962–72</w:t>
-            </w:r>
-          </w:p>
-        </w:tc>
-        <w:tc>
-          <w:tcPr>
-            <w:tcW w:type="dxa" w:w="1728"/>
-          </w:tcPr>
-          <w:p>
-            <w:r>
-              <w:rPr>
-                <w:sz w:val="17"/>
-              </w:rPr>
-              <w:t>1956</w:t>
-            </w:r>
-          </w:p>
-        </w:tc>
-      </w:tr>
-      <w:tr>
-        <w:tc>
-          <w:tcPr>
-            <w:tcW w:type="dxa" w:w="1728"/>
-          </w:tcPr>
-          <w:p>
-            <w:r>
-              <w:rPr>
-                <w:sz w:val="17"/>
-              </w:rPr>
-              <w:t>DIS</w:t>
-            </w:r>
-          </w:p>
-        </w:tc>
-        <w:tc>
-          <w:tcPr>
-            <w:tcW w:type="dxa" w:w="1728"/>
-          </w:tcPr>
-          <w:p>
-            <w:r>
-              <w:rPr>
-                <w:sz w:val="17"/>
-              </w:rPr>
-              <w:t>Walt Disney</w:t>
-            </w:r>
-          </w:p>
-        </w:tc>
-        <w:tc>
-          <w:tcPr>
-            <w:tcW w:type="dxa" w:w="1728"/>
-          </w:tcPr>
-          <w:p>
-            <w:r>
-              <w:rPr>
-                <w:sz w:val="17"/>
-              </w:rPr>
-              <w:t>Comm Svcs</w:t>
-            </w:r>
-          </w:p>
-        </w:tc>
-        <w:tc>
-          <w:tcPr>
-            <w:tcW w:type="dxa" w:w="1728"/>
-          </w:tcPr>
-          <w:p>
-            <w:r>
-              <w:rPr>
-                <w:sz w:val="17"/>
-              </w:rPr>
-              <w:t>1962</w:t>
-            </w:r>
-          </w:p>
-        </w:tc>
-        <w:tc>
-          <w:tcPr>
-            <w:tcW w:type="dxa" w:w="1728"/>
-          </w:tcPr>
-          <w:p>
-            <w:r>
-              <w:rPr>
-                <w:sz w:val="17"/>
-              </w:rPr>
-              <w:t>1957</w:t>
-            </w:r>
-          </w:p>
-        </w:tc>
-      </w:tr>
-      <w:tr>
-        <w:tc>
-          <w:tcPr>
-            <w:tcW w:type="dxa" w:w="1728"/>
-          </w:tcPr>
-          <w:p>
-            <w:r>
-              <w:rPr>
-                <w:sz w:val="17"/>
-              </w:rPr>
-              <w:t>HPQ</w:t>
-            </w:r>
-          </w:p>
-        </w:tc>
-        <w:tc>
-          <w:tcPr>
-            <w:tcW w:type="dxa" w:w="1728"/>
-          </w:tcPr>
-          <w:p>
-            <w:r>
-              <w:rPr>
-                <w:sz w:val="17"/>
-              </w:rPr>
-              <w:t>HP Inc</w:t>
-            </w:r>
-          </w:p>
-        </w:tc>
-        <w:tc>
-          <w:tcPr>
-            <w:tcW w:type="dxa" w:w="1728"/>
-          </w:tcPr>
-          <w:p>
-            <w:r>
-              <w:rPr>
-                <w:sz w:val="17"/>
-              </w:rPr>
-              <w:t>Info Tech</w:t>
-            </w:r>
-          </w:p>
-        </w:tc>
-        <w:tc>
-          <w:tcPr>
-            <w:tcW w:type="dxa" w:w="1728"/>
-          </w:tcPr>
-          <w:p>
-            <w:r>
-              <w:rPr>
-                <w:sz w:val="17"/>
-              </w:rPr>
-              <w:t>1962</w:t>
-            </w:r>
-          </w:p>
-        </w:tc>
-        <w:tc>
-          <w:tcPr>
-            <w:tcW w:type="dxa" w:w="1728"/>
-          </w:tcPr>
-          <w:p>
-            <w:r>
-              <w:rPr>
-                <w:sz w:val="17"/>
-              </w:rPr>
-              <w:t>1961</w:t>
-            </w:r>
-          </w:p>
-        </w:tc>
-      </w:tr>
-      <w:tr>
-        <w:tc>
-          <w:tcPr>
-            <w:tcW w:type="dxa" w:w="1728"/>
-          </w:tcPr>
-          <w:p>
-            <w:r>
-              <w:rPr>
-                <w:sz w:val="17"/>
-              </w:rPr>
-              <w:t>MCD</w:t>
-            </w:r>
-          </w:p>
-        </w:tc>
-        <w:tc>
-          <w:tcPr>
-            <w:tcW w:type="dxa" w:w="1728"/>
-          </w:tcPr>
-          <w:p>
-            <w:r>
-              <w:rPr>
-                <w:sz w:val="17"/>
-              </w:rPr>
-              <w:t>McDonald's</w:t>
-            </w:r>
-          </w:p>
-        </w:tc>
-        <w:tc>
-          <w:tcPr>
-            <w:tcW w:type="dxa" w:w="1728"/>
-          </w:tcPr>
-          <w:p>
-            <w:r>
-              <w:rPr>
-                <w:sz w:val="17"/>
-              </w:rPr>
-              <w:t>Cons Disc</w:t>
-            </w:r>
-          </w:p>
-        </w:tc>
-        <w:tc>
-          <w:tcPr>
-            <w:tcW w:type="dxa" w:w="1728"/>
-          </w:tcPr>
-          <w:p>
-            <w:r>
-              <w:rPr>
-                <w:sz w:val="17"/>
-              </w:rPr>
-              <w:t>1966</w:t>
-            </w:r>
-          </w:p>
-        </w:tc>
-        <w:tc>
-          <w:tcPr>
-            <w:tcW w:type="dxa" w:w="1728"/>
-          </w:tcPr>
-          <w:p>
-            <w:r>
-              <w:rPr>
-                <w:sz w:val="17"/>
-              </w:rPr>
-              <w:t>1965</w:t>
-            </w:r>
-          </w:p>
-        </w:tc>
-      </w:tr>
-      <w:tr>
-        <w:tc>
-          <w:tcPr>
-            <w:tcW w:type="dxa" w:w="1728"/>
-          </w:tcPr>
-          <w:p>
-            <w:r>
-              <w:rPr>
-                <w:sz w:val="17"/>
-              </w:rPr>
-              <w:t>JPM</w:t>
-            </w:r>
-          </w:p>
-        </w:tc>
-        <w:tc>
-          <w:tcPr>
-            <w:tcW w:type="dxa" w:w="1728"/>
-          </w:tcPr>
-          <w:p>
-            <w:r>
-              <w:rPr>
-                <w:sz w:val="17"/>
-              </w:rPr>
-              <w:t>JPMorgan Chase</w:t>
-            </w:r>
-          </w:p>
-        </w:tc>
-        <w:tc>
-          <w:tcPr>
-            <w:tcW w:type="dxa" w:w="1728"/>
-          </w:tcPr>
-          <w:p>
-            <w:r>
-              <w:rPr>
-                <w:sz w:val="17"/>
-              </w:rPr>
-              <w:t>Financials</w:t>
-            </w:r>
-          </w:p>
-        </w:tc>
-        <w:tc>
-          <w:tcPr>
-            <w:tcW w:type="dxa" w:w="1728"/>
-          </w:tcPr>
-          <w:p>
-            <w:r>
-              <w:rPr>
-                <w:sz w:val="17"/>
-              </w:rPr>
-              <w:t>~1980</w:t>
-            </w:r>
-          </w:p>
-        </w:tc>
-        <w:tc>
-          <w:tcPr>
-            <w:tcW w:type="dxa" w:w="1728"/>
-          </w:tcPr>
-          <w:p>
-            <w:r>
-              <w:rPr>
-                <w:sz w:val="17"/>
-              </w:rPr>
-              <w:t>1969</w:t>
-            </w:r>
-          </w:p>
-        </w:tc>
-      </w:tr>
-      <w:tr>
-        <w:tc>
-          <w:tcPr>
-            <w:tcW w:type="dxa" w:w="1728"/>
-          </w:tcPr>
-          <w:p>
-            <w:r>
-              <w:rPr>
-                <w:sz w:val="17"/>
-              </w:rPr>
-              <w:t>WMT</w:t>
-            </w:r>
-          </w:p>
-        </w:tc>
-        <w:tc>
-          <w:tcPr>
-            <w:tcW w:type="dxa" w:w="1728"/>
-          </w:tcPr>
-          <w:p>
-            <w:r>
-              <w:rPr>
-                <w:sz w:val="17"/>
-              </w:rPr>
-              <w:t>Walmart</w:t>
-            </w:r>
-          </w:p>
-        </w:tc>
-        <w:tc>
-          <w:tcPr>
-            <w:tcW w:type="dxa" w:w="1728"/>
-          </w:tcPr>
-          <w:p>
-            <w:r>
-              <w:rPr>
-                <w:sz w:val="17"/>
-              </w:rPr>
-              <w:t>Staples</w:t>
-            </w:r>
-          </w:p>
-        </w:tc>
-        <w:tc>
-          <w:tcPr>
-            <w:tcW w:type="dxa" w:w="1728"/>
-          </w:tcPr>
-          <w:p>
-            <w:r>
-              <w:rPr>
-                <w:sz w:val="17"/>
-              </w:rPr>
-              <w:t>1972</w:t>
-            </w:r>
-          </w:p>
-        </w:tc>
-        <w:tc>
-          <w:tcPr>
-            <w:tcW w:type="dxa" w:w="1728"/>
-          </w:tcPr>
-          <w:p>
-            <w:r>
-              <w:rPr>
-                <w:sz w:val="17"/>
-              </w:rPr>
-              <w:t>1970</w:t>
-            </w:r>
-          </w:p>
-        </w:tc>
-      </w:tr>
-      <w:tr>
-        <w:tc>
-          <w:tcPr>
-            <w:tcW w:type="dxa" w:w="1728"/>
-          </w:tcPr>
-          <w:p>
-            <w:r>
-              <w:rPr>
-                <w:sz w:val="17"/>
-              </w:rPr>
-              <w:t>INTC</w:t>
-            </w:r>
-          </w:p>
-        </w:tc>
-        <w:tc>
-          <w:tcPr>
-            <w:tcW w:type="dxa" w:w="1728"/>
-          </w:tcPr>
-          <w:p>
-            <w:r>
-              <w:rPr>
-                <w:sz w:val="17"/>
-              </w:rPr>
-              <w:t>Intel</w:t>
-            </w:r>
-          </w:p>
-        </w:tc>
-        <w:tc>
-          <w:tcPr>
-            <w:tcW w:type="dxa" w:w="1728"/>
-          </w:tcPr>
-          <w:p>
-            <w:r>
-              <w:rPr>
-                <w:sz w:val="17"/>
-              </w:rPr>
-              <w:t>Info Tech</w:t>
-            </w:r>
-          </w:p>
-        </w:tc>
-        <w:tc>
-          <w:tcPr>
-            <w:tcW w:type="dxa" w:w="1728"/>
-          </w:tcPr>
-          <w:p>
-            <w:r>
-              <w:rPr>
-                <w:sz w:val="17"/>
-              </w:rPr>
-              <w:t>~1980</w:t>
-            </w:r>
-          </w:p>
-        </w:tc>
-        <w:tc>
-          <w:tcPr>
-            <w:tcW w:type="dxa" w:w="1728"/>
-          </w:tcPr>
-          <w:p>
-            <w:r>
-              <w:rPr>
-                <w:sz w:val="17"/>
-              </w:rPr>
-              <w:t>1972 (Nasdaq)</w:t>
-            </w:r>
-          </w:p>
-        </w:tc>
-      </w:tr>
-      <w:tr>
-        <w:tc>
-          <w:tcPr>
-            <w:tcW w:type="dxa" w:w="1728"/>
-          </w:tcPr>
-          <w:p>
-            <w:r>
-              <w:rPr>
-                <w:sz w:val="17"/>
-              </w:rPr>
-              <w:t>AXP</w:t>
-            </w:r>
-          </w:p>
-        </w:tc>
-        <w:tc>
-          <w:tcPr>
-            <w:tcW w:type="dxa" w:w="1728"/>
-          </w:tcPr>
-          <w:p>
-            <w:r>
-              <w:rPr>
-                <w:sz w:val="17"/>
-              </w:rPr>
-              <w:t>American Express</w:t>
-            </w:r>
-          </w:p>
-        </w:tc>
-        <w:tc>
-          <w:tcPr>
-            <w:tcW w:type="dxa" w:w="1728"/>
-          </w:tcPr>
-          <w:p>
-            <w:r>
-              <w:rPr>
-                <w:sz w:val="17"/>
-              </w:rPr>
-              <w:t>Financials</w:t>
-            </w:r>
-          </w:p>
-        </w:tc>
-        <w:tc>
-          <w:tcPr>
-            <w:tcW w:type="dxa" w:w="1728"/>
-          </w:tcPr>
-          <w:p>
-            <w:r>
-              <w:rPr>
-                <w:sz w:val="17"/>
-              </w:rPr>
-              <w:t>1972</w:t>
-            </w:r>
-          </w:p>
-        </w:tc>
-        <w:tc>
-          <w:tcPr>
-            <w:tcW w:type="dxa" w:w="1728"/>
-          </w:tcPr>
-          <w:p>
-            <w:r>
-              <w:rPr>
-                <w:sz w:val="17"/>
-              </w:rPr>
-              <w:t>1972</w:t>
-            </w:r>
-          </w:p>
-        </w:tc>
-      </w:tr>
-      <w:tr>
-        <w:tc>
-          <w:tcPr>
-            <w:tcW w:type="dxa" w:w="1728"/>
-          </w:tcPr>
-          <w:p>
-            <w:r>
-              <w:rPr>
-                <w:sz w:val="17"/>
-              </w:rPr>
-              <w:t>HD</w:t>
-            </w:r>
-          </w:p>
-        </w:tc>
-        <w:tc>
-          <w:tcPr>
-            <w:tcW w:type="dxa" w:w="1728"/>
-          </w:tcPr>
-          <w:p>
-            <w:r>
-              <w:rPr>
-                <w:sz w:val="17"/>
-              </w:rPr>
-              <w:t>Home Depot</w:t>
-            </w:r>
-          </w:p>
-        </w:tc>
-        <w:tc>
-          <w:tcPr>
-            <w:tcW w:type="dxa" w:w="1728"/>
-          </w:tcPr>
-          <w:p>
-            <w:r>
-              <w:rPr>
-                <w:sz w:val="17"/>
-              </w:rPr>
-              <w:t>Cons Disc</w:t>
-            </w:r>
-          </w:p>
-        </w:tc>
-        <w:tc>
-          <w:tcPr>
-            <w:tcW w:type="dxa" w:w="1728"/>
-          </w:tcPr>
-          <w:p>
-            <w:r>
-              <w:rPr>
-                <w:sz w:val="17"/>
-              </w:rPr>
-              <w:t>1981</w:t>
-            </w:r>
-          </w:p>
-        </w:tc>
-        <w:tc>
-          <w:tcPr>
-            <w:tcW w:type="dxa" w:w="1728"/>
-          </w:tcPr>
-          <w:p>
-            <w:r>
-              <w:rPr>
-                <w:sz w:val="17"/>
-              </w:rPr>
-              <w:t>1981</w:t>
-            </w:r>
-          </w:p>
-        </w:tc>
-      </w:tr>
-      <w:tr>
-        <w:tc>
-          <w:tcPr>
-            <w:tcW w:type="dxa" w:w="1728"/>
-          </w:tcPr>
-          <w:p>
-            <w:r>
-              <w:rPr>
-                <w:sz w:val="17"/>
-              </w:rPr>
-              <w:t>GM</w:t>
-            </w:r>
-          </w:p>
-        </w:tc>
-        <w:tc>
-          <w:tcPr>
-            <w:tcW w:type="dxa" w:w="1728"/>
-          </w:tcPr>
-          <w:p>
-            <w:r>
-              <w:rPr>
-                <w:sz w:val="17"/>
-              </w:rPr>
-              <w:t>General Motors</w:t>
-            </w:r>
-          </w:p>
-        </w:tc>
-        <w:tc>
-          <w:tcPr>
-            <w:tcW w:type="dxa" w:w="1728"/>
-          </w:tcPr>
-          <w:p>
-            <w:r>
-              <w:rPr>
-                <w:sz w:val="17"/>
-              </w:rPr>
-              <w:t>Cons Disc</w:t>
-            </w:r>
-          </w:p>
-        </w:tc>
-        <w:tc>
-          <w:tcPr>
-            <w:tcW w:type="dxa" w:w="1728"/>
-          </w:tcPr>
-          <w:p>
-            <w:r>
-              <w:rPr>
-                <w:sz w:val="17"/>
-              </w:rPr>
-              <w:t>2010</w:t>
-            </w:r>
-          </w:p>
-        </w:tc>
-        <w:tc>
-          <w:tcPr>
-            <w:tcW w:type="dxa" w:w="1728"/>
-          </w:tcPr>
-          <w:p>
-            <w:r>
-              <w:rPr>
-                <w:sz w:val="17"/>
-              </w:rPr>
-              <w:t>2010 (new entity)</w:t>
-            </w:r>
-          </w:p>
-        </w:tc>
-      </w:tr>
-    </w:tbl>
-    <w:p>
-      <w:pPr>
         <w:ind w:left="432"/>
         <w:shd w:val="clear" w:fill="EEF3FB"/>
       </w:pPr>
@@ -2990,118 +939,13 @@
           <w:b/>
           <w:i/>
         </w:rPr>
-        <w:t>Entity ≠ ticker:</w:t>
+        <w:t>Single-name stocks are intentionally excluded</w:t>
       </w:r>
       <w:r>
         <w:rPr>
           <w:i/>
         </w:rPr>
-        <w:t xml:space="preserve"> GM (old delisted 2009, new IPO 2010), T (1984 breakup), DD/DOW (2017 merge / 2019 split), HON (AlliedSignal 1999). Bias-free history must follow CRSP PERMNO chains and apply delisting returns — not the ticker.</w:t>
-      </w:r>
-    </w:p>
-    <w:p>
-      <w:pPr>
-        <w:pStyle w:val="Heading3"/>
-      </w:pPr>
-      <w:r>
-        <w:t>1c. Sector representation (current liquid large caps, by GICS)</w:t>
-      </w:r>
-    </w:p>
-    <w:p>
-      <w:r>
-        <w:t>IT: AAPL MSFT NVDA AVGO ORCL · Comm Svcs: GOOGL META NFLX DIS T · Cons Disc: AMZN TSLA HD MCD</w:t>
-      </w:r>
-    </w:p>
-    <w:p>
-      <w:r>
-        <w:t>NKE · Staples: PG KO PEP COST WMT · Health: LLY JNJ UNH ABBV MRK · Financials: BRK.B JPM V MA</w:t>
-      </w:r>
-    </w:p>
-    <w:p>
-      <w:r>
-        <w:t>BAC · Industrials: CAT GE BA HON UNP · Energy: XOM CVX COP SLB EOG · Materials: LIN SHW FCX NEM</w:t>
-      </w:r>
-    </w:p>
-    <w:p>
-      <w:r>
-        <w:t>ECL · Real Estate: AMT PLD EQIX WELL SPG · Utilities: NEE SO DUK CEG AEP.</w:t>
-      </w:r>
-    </w:p>
-    <w:p>
-      <w:pPr>
-        <w:pStyle w:val="Heading3"/>
-      </w:pPr>
-      <w:r>
-        <w:t>1d. Single-stock daily history by source</w:t>
-      </w:r>
-    </w:p>
-    <w:p>
-      <w:r>
-        <w:t xml:space="preserve">CRSP </w:t>
-      </w:r>
-      <w:r>
-        <w:rPr>
-          <w:b/>
-        </w:rPr>
-        <w:t>1962-07-02</w:t>
-      </w:r>
-      <w:r>
-        <w:t xml:space="preserve"> daily / </w:t>
-      </w:r>
-      <w:r>
-        <w:rPr>
-          <w:b/>
-        </w:rPr>
-        <w:t>1926</w:t>
-      </w:r>
-      <w:r>
-        <w:t xml:space="preserve"> Pre62 / </w:t>
-      </w:r>
-      <w:r>
-        <w:rPr>
-          <w:b/>
-        </w:rPr>
-        <w:t>1925-12</w:t>
-      </w:r>
-      <w:r>
-        <w:t xml:space="preserve"> monthly (bias-free, incl. delisting</w:t>
-      </w:r>
-    </w:p>
-    <w:p>
-      <w:r>
-        <w:t xml:space="preserve">returns) · Norgate </w:t>
-      </w:r>
-      <w:r>
-        <w:rPr>
-          <w:b/>
-        </w:rPr>
-        <w:t>1950</w:t>
-      </w:r>
-      <w:r>
-        <w:t xml:space="preserve"> (bias-free) · Sharadar </w:t>
-      </w:r>
-      <w:r>
-        <w:rPr>
-          <w:b/>
-        </w:rPr>
-        <w:t>1998</w:t>
-      </w:r>
-      <w:r>
-        <w:t xml:space="preserve"> (bias-free) · Tiingo / yfinance /</w:t>
-      </w:r>
-    </w:p>
-    <w:p>
-      <w:r>
-        <w:t xml:space="preserve">Stooq </w:t>
-      </w:r>
-      <w:r>
-        <w:rPr>
-          <w:b/>
-        </w:rPr>
-        <w:t>~1962</w:t>
-      </w:r>
-      <w:r>
-        <w:t xml:space="preserve"> (survivor-only). Pre-1962 daily single-stock is CRSP-only.</w:t>
+        <w:t xml:space="preserve"> — this universe trades indices, ETFs, and futures, not individual companies. Equity exposure is obtained through the index vehicles in §2 (futures + ETF + cash-index history).</w:t>
       </w:r>
     </w:p>
     <w:p>

</xml_diff>